<commit_message>
Restore formatted table of contents and add institute name to title page
</commit_message>
<xml_diff>
--- a/Final_Internship_Submission/Project_1_Fake_News/fake_news_project_report.docx
+++ b/Final_Internship_Submission/Project_1_Fake_News/fake_news_project_report.docx
@@ -126,6 +126,14 @@
         </w:rPr>
         <w:t>Roll No.: [595766]</w:t>
         <w:br/>
+      </w:r>
+      <w:r>
+        <w:rPr>
+          <w:color w:val="7F7F7F"/>
+          <w:sz w:val="24"/>
+        </w:rPr>
+        <w:t>NMAM Institute Of Technology</w:t>
+        <w:br/>
         <w:br/>
       </w:r>
       <w:r>
@@ -134,6 +142,291 @@
           <w:sz w:val="24"/>
         </w:rPr>
         <w:t>2026</w:t>
+      </w:r>
+    </w:p>
+    <w:p>
+      <w:r>
+        <w:br w:type="page"/>
+      </w:r>
+    </w:p>
+    <w:p>
+      <w:pPr>
+        <w:pStyle w:val="Heading1"/>
+      </w:pPr>
+      <w:r>
+        <w:t>Table of Contents</w:t>
+      </w:r>
+    </w:p>
+    <w:p>
+      <w:pPr>
+        <w:spacing w:after="120"/>
+      </w:pPr>
+      <w:r>
+        <w:rPr>
+          <w:b/>
+        </w:rPr>
+        <w:t>Abstract &amp; Keywords</w:t>
+      </w:r>
+      <w:r>
+        <w:tab/>
+        <w:tab/>
+        <w:tab/>
+        <w:t>3</w:t>
+      </w:r>
+    </w:p>
+    <w:p>
+      <w:pPr>
+        <w:spacing w:after="120"/>
+      </w:pPr>
+      <w:r>
+        <w:rPr>
+          <w:b/>
+        </w:rPr>
+        <w:t>Introduction</w:t>
+      </w:r>
+      <w:r>
+        <w:tab/>
+        <w:tab/>
+        <w:tab/>
+        <w:t>4</w:t>
+      </w:r>
+    </w:p>
+    <w:p>
+      <w:pPr>
+        <w:spacing w:after="120"/>
+      </w:pPr>
+      <w:r>
+        <w:rPr>
+          <w:b/>
+        </w:rPr>
+        <w:t>Problem Statement &amp; Objectives</w:t>
+      </w:r>
+      <w:r>
+        <w:tab/>
+        <w:tab/>
+        <w:tab/>
+        <w:t>5</w:t>
+      </w:r>
+    </w:p>
+    <w:p>
+      <w:pPr>
+        <w:spacing w:after="120"/>
+      </w:pPr>
+      <w:r>
+        <w:rPr>
+          <w:b/>
+        </w:rPr>
+        <w:t>Literature Review</w:t>
+      </w:r>
+      <w:r>
+        <w:tab/>
+        <w:tab/>
+        <w:tab/>
+        <w:t>6</w:t>
+      </w:r>
+    </w:p>
+    <w:p>
+      <w:pPr>
+        <w:spacing w:after="120"/>
+      </w:pPr>
+      <w:r>
+        <w:rPr>
+          <w:b/>
+        </w:rPr>
+        <w:t>Proposed Methodology</w:t>
+      </w:r>
+      <w:r>
+        <w:tab/>
+        <w:tab/>
+        <w:tab/>
+        <w:t>8</w:t>
+      </w:r>
+    </w:p>
+    <w:p>
+      <w:pPr>
+        <w:spacing w:after="120"/>
+      </w:pPr>
+      <w:r>
+        <w:rPr>
+          <w:b/>
+        </w:rPr>
+        <w:t>Dataset Description</w:t>
+      </w:r>
+      <w:r>
+        <w:tab/>
+        <w:tab/>
+        <w:tab/>
+        <w:t>9</w:t>
+      </w:r>
+    </w:p>
+    <w:p>
+      <w:pPr>
+        <w:spacing w:after="120"/>
+      </w:pPr>
+      <w:r>
+        <w:rPr>
+          <w:b/>
+        </w:rPr>
+        <w:t>Data Preprocessing</w:t>
+      </w:r>
+      <w:r>
+        <w:tab/>
+        <w:tab/>
+        <w:tab/>
+        <w:t>10</w:t>
+      </w:r>
+    </w:p>
+    <w:p>
+      <w:pPr>
+        <w:spacing w:after="120"/>
+      </w:pPr>
+      <w:r>
+        <w:rPr>
+          <w:b/>
+        </w:rPr>
+        <w:t>Feature Engineering</w:t>
+      </w:r>
+      <w:r>
+        <w:tab/>
+        <w:tab/>
+        <w:tab/>
+        <w:t>11</w:t>
+      </w:r>
+    </w:p>
+    <w:p>
+      <w:pPr>
+        <w:spacing w:after="120"/>
+      </w:pPr>
+      <w:r>
+        <w:rPr>
+          <w:b/>
+        </w:rPr>
+        <w:t>Machine Learning Models</w:t>
+      </w:r>
+      <w:r>
+        <w:tab/>
+        <w:tab/>
+        <w:tab/>
+        <w:t>12</w:t>
+      </w:r>
+    </w:p>
+    <w:p>
+      <w:pPr>
+        <w:spacing w:after="120"/>
+      </w:pPr>
+      <w:r>
+        <w:rPr>
+          <w:b/>
+        </w:rPr>
+        <w:t>Model Training</w:t>
+      </w:r>
+      <w:r>
+        <w:tab/>
+        <w:tab/>
+        <w:tab/>
+        <w:t>15</w:t>
+      </w:r>
+    </w:p>
+    <w:p>
+      <w:pPr>
+        <w:spacing w:after="120"/>
+      </w:pPr>
+      <w:r>
+        <w:rPr>
+          <w:b/>
+        </w:rPr>
+        <w:t>Results &amp; Evaluation</w:t>
+      </w:r>
+      <w:r>
+        <w:tab/>
+        <w:tab/>
+        <w:tab/>
+        <w:t>16</w:t>
+      </w:r>
+    </w:p>
+    <w:p>
+      <w:pPr>
+        <w:spacing w:after="120"/>
+      </w:pPr>
+      <w:r>
+        <w:rPr>
+          <w:b/>
+        </w:rPr>
+        <w:t>Feature Importance &amp; Analysis</w:t>
+      </w:r>
+      <w:r>
+        <w:tab/>
+        <w:tab/>
+        <w:tab/>
+        <w:t>18</w:t>
+      </w:r>
+    </w:p>
+    <w:p>
+      <w:pPr>
+        <w:spacing w:after="120"/>
+      </w:pPr>
+      <w:r>
+        <w:rPr>
+          <w:b/>
+        </w:rPr>
+        <w:t>Prediction Module</w:t>
+      </w:r>
+      <w:r>
+        <w:tab/>
+        <w:tab/>
+        <w:tab/>
+        <w:t>19</w:t>
+      </w:r>
+    </w:p>
+    <w:p>
+      <w:pPr>
+        <w:spacing w:after="120"/>
+      </w:pPr>
+      <w:r>
+        <w:rPr>
+          <w:b/>
+        </w:rPr>
+        <w:t>Advantages, Limitations &amp; Future Scope</w:t>
+      </w:r>
+      <w:r>
+        <w:tab/>
+        <w:tab/>
+        <w:tab/>
+        <w:t>20</w:t>
+      </w:r>
+    </w:p>
+    <w:p>
+      <w:pPr>
+        <w:spacing w:after="120"/>
+      </w:pPr>
+      <w:r>
+        <w:rPr>
+          <w:b/>
+        </w:rPr>
+        <w:t>Conclusion</w:t>
+      </w:r>
+      <w:r>
+        <w:tab/>
+        <w:tab/>
+        <w:tab/>
+        <w:t>21</w:t>
+      </w:r>
+    </w:p>
+    <w:p>
+      <w:pPr>
+        <w:spacing w:after="120"/>
+      </w:pPr>
+      <w:r>
+        <w:rPr>
+          <w:b/>
+        </w:rPr>
+        <w:t>References</w:t>
+      </w:r>
+      <w:r>
+        <w:tab/>
+        <w:tab/>
+        <w:tab/>
+        <w:t>22</w:t>
       </w:r>
     </w:p>
     <w:p>

</xml_diff>

<commit_message>
Remove hardcoded table of contents from the 20-page docx reports and re-zip
</commit_message>
<xml_diff>
--- a/Final_Internship_Submission/Project_1_Fake_News/fake_news_project_report.docx
+++ b/Final_Internship_Submission/Project_1_Fake_News/fake_news_project_report.docx
@@ -133,126 +133,6 @@
         <w:t xml:space="preserve">2026</w:t>
       </w:r>
     </w:p>
-    <w:tbl>
-      <w:tblPr>
-        <w:tblStyle w:val="Table"/>
-        <w:tblW w:type="pct" w:w="278"/>
-        <w:tblLayout w:type="fixed"/>
-        <w:tblLook w:firstRow="0" w:lastRow="0" w:firstColumn="0" w:lastColumn="0" w:noHBand="0" w:noVBand="0" w:val="0000"/>
-      </w:tblPr>
-      <w:tblGrid>
-        <w:gridCol w:w="440"/>
-      </w:tblGrid>
-      <w:tr>
-        <w:tc>
-          <w:tcPr/>
-          <w:p>
-            <w:pPr>
-              <w:pStyle w:val="Compact"/>
-            </w:pPr>
-            <w:r>
-              <w:t xml:space="preserve"># Table of Contents</w:t>
-            </w:r>
-            <w:r>
-              <w:t xml:space="preserve"> </w:t>
-            </w:r>
-            <w:r>
-              <w:t xml:space="preserve">Abstract &amp; Keywords 3</w:t>
-            </w:r>
-            <w:r>
-              <w:t xml:space="preserve"> </w:t>
-            </w:r>
-            <w:r>
-              <w:t xml:space="preserve">Introduction 4</w:t>
-            </w:r>
-            <w:r>
-              <w:t xml:space="preserve"> </w:t>
-            </w:r>
-            <w:r>
-              <w:t xml:space="preserve">Problem Statement &amp; Objectives 5</w:t>
-            </w:r>
-            <w:r>
-              <w:t xml:space="preserve"> </w:t>
-            </w:r>
-            <w:r>
-              <w:t xml:space="preserve">Literature Review 6</w:t>
-            </w:r>
-            <w:r>
-              <w:t xml:space="preserve"> </w:t>
-            </w:r>
-            <w:r>
-              <w:t xml:space="preserve">Proposed Methodology 8</w:t>
-            </w:r>
-            <w:r>
-              <w:t xml:space="preserve"> </w:t>
-            </w:r>
-            <w:r>
-              <w:t xml:space="preserve">Dataset Description 9</w:t>
-            </w:r>
-            <w:r>
-              <w:t xml:space="preserve"> </w:t>
-            </w:r>
-            <w:r>
-              <w:t xml:space="preserve">Data Preprocessing 10</w:t>
-            </w:r>
-            <w:r>
-              <w:t xml:space="preserve"> </w:t>
-            </w:r>
-            <w:r>
-              <w:t xml:space="preserve">Feature Engineering 11</w:t>
-            </w:r>
-            <w:r>
-              <w:t xml:space="preserve"> </w:t>
-            </w:r>
-            <w:r>
-              <w:t xml:space="preserve">Machine Learning Models 12</w:t>
-            </w:r>
-            <w:r>
-              <w:t xml:space="preserve"> </w:t>
-            </w:r>
-            <w:r>
-              <w:t xml:space="preserve">Model Training 15</w:t>
-            </w:r>
-            <w:r>
-              <w:t xml:space="preserve"> </w:t>
-            </w:r>
-            <w:r>
-              <w:t xml:space="preserve">Results &amp; Evaluation 16</w:t>
-            </w:r>
-            <w:r>
-              <w:t xml:space="preserve"> </w:t>
-            </w:r>
-            <w:r>
-              <w:t xml:space="preserve">Feature Importance &amp; Analysis 18</w:t>
-            </w:r>
-            <w:r>
-              <w:t xml:space="preserve"> </w:t>
-            </w:r>
-            <w:r>
-              <w:t xml:space="preserve">Prediction Module 19</w:t>
-            </w:r>
-            <w:r>
-              <w:t xml:space="preserve"> </w:t>
-            </w:r>
-            <w:r>
-              <w:t xml:space="preserve">Advantages, Limitations &amp; Future Scope 20</w:t>
-            </w:r>
-            <w:r>
-              <w:t xml:space="preserve"> </w:t>
-            </w:r>
-            <w:r>
-              <w:t xml:space="preserve">Conclusion 21</w:t>
-            </w:r>
-            <w:r>
-              <w:t xml:space="preserve"> </w:t>
-            </w:r>
-            <w:r>
-              <w:t xml:space="preserve">References 22</w:t>
-            </w:r>
-          </w:p>
-        </w:tc>
-      </w:tr>
-    </w:tbl>
     <w:bookmarkEnd w:id="12"/>
     <w:bookmarkEnd w:id="13"/>
     <w:bookmarkStart w:id="14" w:name="abstract-keywords"/>

</xml_diff>

<commit_message>
Replace college logo placeholder text with actual logo image in 20-page reports and re-zip
</commit_message>
<xml_diff>
--- a/Final_Internship_Submission/Project_1_Fake_News/fake_news_project_report.docx
+++ b/Final_Internship_Submission/Project_1_Fake_News/fake_news_project_report.docx
@@ -71,18 +71,40 @@
       <w:pPr>
         <w:pStyle w:val="FirstParagraph"/>
       </w:pPr>
-      <w:r>
-        <w:t xml:space="preserve"> </w:t>
-      </w:r>
-      <w:r>
-        <w:rPr>
-          <w:i/>
-          <w:iCs/>
-        </w:rPr>
-        <w:t xml:space="preserve">(Insert College Logo Here)</w:t>
-      </w:r>
-      <w:r>
-        <w:t xml:space="preserve"> </w:t>
+      <w:r/>
+      <w:r>
+        <w:drawing>
+          <wp:inline>
+            <wp:extent cx="1828800" cy="1224793"/>
+            <wp:docPr id="12" name="Picture 12"/>
+            <wp:cNvGraphicFramePr>
+              <a:graphicFrameLocks noChangeAspect="1"/>
+            </wp:cNvGraphicFramePr>
+            <a:graphic>
+              <a:graphicData uri="http://schemas.openxmlformats.org/drawingml/2006/picture">
+                <pic:pic>
+                  <pic:nvPicPr>
+                    <pic:cNvPr id="0" name="image.png"/>
+                    <pic:cNvPicPr/>
+                  </pic:nvPicPr>
+                  <pic:blipFill>
+                    <a:blip r:embed="rId9"/>
+                    <a:stretch>
+                      <a:fillRect/>
+                    </a:stretch>
+                  </pic:blipFill>
+                  <pic:spPr>
+                    <a:xfrm>
+                      <a:off x="0" y="0"/>
+                      <a:ext cx="1828800" cy="1224793"/>
+                    </a:xfrm>
+                    <a:prstGeom prst="rect"/>
+                  </pic:spPr>
+                </pic:pic>
+              </a:graphicData>
+            </a:graphic>
+          </wp:inline>
+        </w:drawing>
       </w:r>
     </w:p>
     <w:bookmarkStart w:id="12" w:name="nmam-institute-of-technology"/>

</xml_diff>